<commit_message>
modified the readme and document file
</commit_message>
<xml_diff>
--- a/devops-build-documentation.docx
+++ b/devops-build-documentation.docx
@@ -24,7 +24,7 @@
       <w:r>
         <w:rPr/>
         <w:drawing>
-          <wp:anchor behindDoc="0" distT="0" distB="0" distL="0" distR="0" simplePos="0" locked="0" layoutInCell="0" allowOverlap="1" relativeHeight="5">
+          <wp:anchor behindDoc="0" distT="0" distB="0" distL="0" distR="0" simplePos="0" locked="0" layoutInCell="0" allowOverlap="1" relativeHeight="3">
             <wp:simplePos x="0" y="0"/>
             <wp:positionH relativeFrom="column">
               <wp:posOffset>36195</wp:posOffset>
@@ -114,7 +114,7 @@
       <w:r>
         <w:rPr/>
         <w:drawing>
-          <wp:anchor behindDoc="0" distT="0" distB="0" distL="0" distR="0" simplePos="0" locked="0" layoutInCell="0" allowOverlap="1" relativeHeight="4">
+          <wp:anchor behindDoc="0" distT="0" distB="0" distL="0" distR="0" simplePos="0" locked="0" layoutInCell="0" allowOverlap="1" relativeHeight="2">
             <wp:simplePos x="0" y="0"/>
             <wp:positionH relativeFrom="column">
               <wp:posOffset>-138430</wp:posOffset>
@@ -303,7 +303,7 @@
       <w:r>
         <w:rPr/>
         <w:drawing>
-          <wp:anchor behindDoc="0" distT="0" distB="0" distL="0" distR="0" simplePos="0" locked="0" layoutInCell="0" allowOverlap="1" relativeHeight="6">
+          <wp:anchor behindDoc="0" distT="0" distB="0" distL="0" distR="0" simplePos="0" locked="0" layoutInCell="0" allowOverlap="1" relativeHeight="4">
             <wp:simplePos x="0" y="0"/>
             <wp:positionH relativeFrom="column">
               <wp:posOffset>-168275</wp:posOffset>
@@ -404,7 +404,7 @@
       <w:r>
         <w:rPr/>
         <w:drawing>
-          <wp:anchor behindDoc="0" distT="0" distB="0" distL="0" distR="0" simplePos="0" locked="0" layoutInCell="0" allowOverlap="1" relativeHeight="8">
+          <wp:anchor behindDoc="0" distT="0" distB="0" distL="0" distR="0" simplePos="0" locked="0" layoutInCell="0" allowOverlap="1" relativeHeight="6">
             <wp:simplePos x="0" y="0"/>
             <wp:positionH relativeFrom="column">
               <wp:posOffset>-94615</wp:posOffset>
@@ -493,7 +493,7 @@
       <w:r>
         <w:rPr/>
         <w:drawing>
-          <wp:anchor behindDoc="0" distT="0" distB="0" distL="0" distR="0" simplePos="0" locked="0" layoutInCell="0" allowOverlap="1" relativeHeight="7">
+          <wp:anchor behindDoc="0" distT="0" distB="0" distL="0" distR="0" simplePos="0" locked="0" layoutInCell="0" allowOverlap="1" relativeHeight="5">
             <wp:simplePos x="0" y="0"/>
             <wp:positionH relativeFrom="column">
               <wp:posOffset>-21590</wp:posOffset>
@@ -614,16 +614,40 @@
         <w:rPr/>
       </w:pPr>
       <w:r>
+        <w:rPr/>
+        <w:t>Successful execution of the Jenkins Pipeline</w:t>
+      </w:r>
+    </w:p>
+    <w:p>
+      <w:pPr>
+        <w:pStyle w:val="Normal"/>
+        <w:bidi w:val="0"/>
+        <w:jc w:val="start"/>
+        <w:rPr/>
+      </w:pPr>
+      <w:r>
+        <w:rPr/>
+      </w:r>
+    </w:p>
+    <w:p>
+      <w:pPr>
+        <w:pStyle w:val="Normal"/>
+        <w:bidi w:val="0"/>
+        <w:jc w:val="start"/>
+        <w:rPr/>
+      </w:pPr>
+      <w:r>
+        <w:rPr/>
         <w:drawing>
-          <wp:anchor behindDoc="0" distT="0" distB="0" distL="0" distR="0" simplePos="0" locked="0" layoutInCell="0" allowOverlap="1" relativeHeight="3">
+          <wp:anchor behindDoc="0" distT="0" distB="0" distL="0" distR="0" simplePos="0" locked="0" layoutInCell="0" allowOverlap="1" relativeHeight="8">
             <wp:simplePos x="0" y="0"/>
             <wp:positionH relativeFrom="column">
-              <wp:posOffset>21590</wp:posOffset>
+              <wp:align>center</wp:align>
             </wp:positionH>
             <wp:positionV relativeFrom="paragraph">
-              <wp:posOffset>453390</wp:posOffset>
+              <wp:posOffset>635</wp:posOffset>
             </wp:positionV>
-            <wp:extent cx="6120130" cy="3333750"/>
+            <wp:extent cx="6120130" cy="3321685"/>
             <wp:effectExtent l="0" t="0" r="0" b="0"/>
             <wp:wrapSquare wrapText="largest"/>
             <wp:docPr id="6" name="Image2" descr="" title=""/>
@@ -648,7 +672,7 @@
                   <pic:spPr bwMode="auto">
                     <a:xfrm>
                       <a:off x="0" y="0"/>
-                      <a:ext cx="6120130" cy="3333750"/>
+                      <a:ext cx="6120130" cy="3321685"/>
                     </a:xfrm>
                     <a:prstGeom prst="rect">
                       <a:avLst/>
@@ -660,32 +684,6 @@
           </wp:anchor>
         </w:drawing>
       </w:r>
-      <w:r>
-        <w:rPr/>
-        <w:t>Successful execution of the Jenkins Pipeline</w:t>
-      </w:r>
-    </w:p>
-    <w:p>
-      <w:pPr>
-        <w:pStyle w:val="Normal"/>
-        <w:bidi w:val="0"/>
-        <w:jc w:val="start"/>
-        <w:rPr/>
-      </w:pPr>
-      <w:r>
-        <w:rPr/>
-      </w:r>
-    </w:p>
-    <w:p>
-      <w:pPr>
-        <w:pStyle w:val="Normal"/>
-        <w:bidi w:val="0"/>
-        <w:jc w:val="start"/>
-        <w:rPr/>
-      </w:pPr>
-      <w:r>
-        <w:rPr/>
-      </w:r>
     </w:p>
     <w:p>
       <w:pPr>
@@ -797,15 +795,15 @@
       <w:r>
         <w:rPr/>
         <w:drawing>
-          <wp:anchor behindDoc="0" distT="0" distB="0" distL="0" distR="0" simplePos="0" locked="0" layoutInCell="0" allowOverlap="1" relativeHeight="2">
+          <wp:anchor behindDoc="0" distT="0" distB="0" distL="0" distR="0" simplePos="0" locked="0" layoutInCell="0" allowOverlap="1" relativeHeight="9">
             <wp:simplePos x="0" y="0"/>
             <wp:positionH relativeFrom="column">
-              <wp:posOffset>0</wp:posOffset>
+              <wp:align>center</wp:align>
             </wp:positionH>
             <wp:positionV relativeFrom="paragraph">
-              <wp:posOffset>69215</wp:posOffset>
+              <wp:posOffset>635</wp:posOffset>
             </wp:positionV>
-            <wp:extent cx="6120130" cy="3333750"/>
+            <wp:extent cx="6120130" cy="3321685"/>
             <wp:effectExtent l="0" t="0" r="0" b="0"/>
             <wp:wrapSquare wrapText="largest"/>
             <wp:docPr id="7" name="Image1" descr="" title=""/>
@@ -830,7 +828,7 @@
                   <pic:spPr bwMode="auto">
                     <a:xfrm>
                       <a:off x="0" y="0"/>
-                      <a:ext cx="6120130" cy="3333750"/>
+                      <a:ext cx="6120130" cy="3321685"/>
                     </a:xfrm>
                     <a:prstGeom prst="rect">
                       <a:avLst/>
@@ -874,105 +872,208 @@
       </w:pPr>
       <w:r>
         <w:rPr/>
-      </w:r>
-    </w:p>
-    <w:p>
-      <w:pPr>
-        <w:pStyle w:val="Normal"/>
-        <w:bidi w:val="0"/>
-        <w:jc w:val="start"/>
-        <w:rPr/>
-      </w:pPr>
-      <w:r>
-        <w:rPr/>
-      </w:r>
-    </w:p>
-    <w:p>
-      <w:pPr>
-        <w:pStyle w:val="Normal"/>
-        <w:bidi w:val="0"/>
-        <w:jc w:val="start"/>
-        <w:rPr/>
-      </w:pPr>
-      <w:r>
-        <w:rPr/>
-      </w:r>
-    </w:p>
-    <w:p>
-      <w:pPr>
-        <w:pStyle w:val="Normal"/>
-        <w:bidi w:val="0"/>
-        <w:jc w:val="start"/>
-        <w:rPr/>
-      </w:pPr>
-      <w:r>
-        <w:rPr/>
-      </w:r>
-    </w:p>
-    <w:p>
-      <w:pPr>
-        <w:pStyle w:val="Normal"/>
-        <w:bidi w:val="0"/>
-        <w:jc w:val="start"/>
-        <w:rPr/>
-      </w:pPr>
-      <w:r>
-        <w:rPr/>
-      </w:r>
-    </w:p>
-    <w:p>
-      <w:pPr>
-        <w:pStyle w:val="Normal"/>
-        <w:bidi w:val="0"/>
-        <w:jc w:val="start"/>
-        <w:rPr/>
-      </w:pPr>
-      <w:r>
-        <w:rPr/>
-      </w:r>
-    </w:p>
-    <w:p>
-      <w:pPr>
-        <w:pStyle w:val="Normal"/>
-        <w:bidi w:val="0"/>
-        <w:jc w:val="start"/>
-        <w:rPr/>
-      </w:pPr>
-      <w:r>
-        <w:rPr/>
-      </w:r>
-    </w:p>
-    <w:p>
-      <w:pPr>
-        <w:pStyle w:val="Normal"/>
-        <w:bidi w:val="0"/>
-        <w:jc w:val="start"/>
-        <w:rPr/>
-      </w:pPr>
-      <w:r>
-        <w:rPr/>
-      </w:r>
-    </w:p>
-    <w:p>
-      <w:pPr>
-        <w:pStyle w:val="Normal"/>
-        <w:bidi w:val="0"/>
-        <w:jc w:val="start"/>
-        <w:rPr/>
-      </w:pPr>
-      <w:r>
-        <w:rPr/>
-      </w:r>
-    </w:p>
-    <w:p>
-      <w:pPr>
-        <w:pStyle w:val="Normal"/>
-        <w:bidi w:val="0"/>
-        <w:jc w:val="start"/>
-        <w:rPr/>
-      </w:pPr>
-      <w:r>
-        <w:rPr/>
+        <w:t>Health check for the site</w:t>
+      </w:r>
+    </w:p>
+    <w:p>
+      <w:pPr>
+        <w:pStyle w:val="Normal"/>
+        <w:bidi w:val="0"/>
+        <w:jc w:val="start"/>
+        <w:rPr/>
+      </w:pPr>
+      <w:r>
+        <w:rPr/>
+      </w:r>
+    </w:p>
+    <w:p>
+      <w:pPr>
+        <w:pStyle w:val="Normal"/>
+        <w:bidi w:val="0"/>
+        <w:jc w:val="start"/>
+        <w:rPr/>
+      </w:pPr>
+      <w:r>
+        <w:rPr/>
+        <w:drawing>
+          <wp:anchor behindDoc="0" distT="0" distB="0" distL="0" distR="0" simplePos="0" locked="0" layoutInCell="0" allowOverlap="1" relativeHeight="7">
+            <wp:simplePos x="0" y="0"/>
+            <wp:positionH relativeFrom="column">
+              <wp:align>center</wp:align>
+            </wp:positionH>
+            <wp:positionV relativeFrom="paragraph">
+              <wp:posOffset>635</wp:posOffset>
+            </wp:positionV>
+            <wp:extent cx="6120130" cy="3321685"/>
+            <wp:effectExtent l="0" t="0" r="0" b="0"/>
+            <wp:wrapSquare wrapText="largest"/>
+            <wp:docPr id="8" name="Image8" descr="" title=""/>
+            <wp:cNvGraphicFramePr>
+              <a:graphicFrameLocks xmlns:a="http://schemas.openxmlformats.org/drawingml/2006/main" noChangeAspect="1"/>
+            </wp:cNvGraphicFramePr>
+            <a:graphic xmlns:a="http://schemas.openxmlformats.org/drawingml/2006/main">
+              <a:graphicData uri="http://schemas.openxmlformats.org/drawingml/2006/picture">
+                <pic:pic xmlns:pic="http://schemas.openxmlformats.org/drawingml/2006/picture">
+                  <pic:nvPicPr>
+                    <pic:cNvPr id="8" name="Image8" descr="" title=""/>
+                    <pic:cNvPicPr>
+                      <a:picLocks noChangeAspect="1" noChangeArrowheads="1"/>
+                    </pic:cNvPicPr>
+                  </pic:nvPicPr>
+                  <pic:blipFill>
+                    <a:blip r:embed="rId9"/>
+                    <a:stretch>
+                      <a:fillRect/>
+                    </a:stretch>
+                  </pic:blipFill>
+                  <pic:spPr bwMode="auto">
+                    <a:xfrm>
+                      <a:off x="0" y="0"/>
+                      <a:ext cx="6120130" cy="3321685"/>
+                    </a:xfrm>
+                    <a:prstGeom prst="rect">
+                      <a:avLst/>
+                    </a:prstGeom>
+                  </pic:spPr>
+                </pic:pic>
+              </a:graphicData>
+            </a:graphic>
+          </wp:anchor>
+        </w:drawing>
+      </w:r>
+    </w:p>
+    <w:p>
+      <w:pPr>
+        <w:pStyle w:val="Normal"/>
+        <w:bidi w:val="0"/>
+        <w:jc w:val="start"/>
+        <w:rPr/>
+      </w:pPr>
+      <w:r>
+        <w:rPr/>
+      </w:r>
+    </w:p>
+    <w:p>
+      <w:pPr>
+        <w:pStyle w:val="Normal"/>
+        <w:bidi w:val="0"/>
+        <w:jc w:val="start"/>
+        <w:rPr/>
+      </w:pPr>
+      <w:r>
+        <w:rPr/>
+      </w:r>
+    </w:p>
+    <w:p>
+      <w:pPr>
+        <w:pStyle w:val="Normal"/>
+        <w:bidi w:val="0"/>
+        <w:jc w:val="start"/>
+        <w:rPr/>
+      </w:pPr>
+      <w:r>
+        <w:rPr/>
+      </w:r>
+    </w:p>
+    <w:p>
+      <w:pPr>
+        <w:pStyle w:val="Normal"/>
+        <w:bidi w:val="0"/>
+        <w:jc w:val="start"/>
+        <w:rPr/>
+      </w:pPr>
+      <w:r>
+        <w:rPr/>
+      </w:r>
+    </w:p>
+    <w:p>
+      <w:pPr>
+        <w:pStyle w:val="Normal"/>
+        <w:bidi w:val="0"/>
+        <w:jc w:val="start"/>
+        <w:rPr/>
+      </w:pPr>
+      <w:r>
+        <w:rPr/>
+      </w:r>
+    </w:p>
+    <w:p>
+      <w:pPr>
+        <w:pStyle w:val="Normal"/>
+        <w:bidi w:val="0"/>
+        <w:jc w:val="start"/>
+        <w:rPr/>
+      </w:pPr>
+      <w:r>
+        <w:rPr/>
+        <w:t xml:space="preserve">Alert details to be set </w:t>
+      </w:r>
+    </w:p>
+    <w:p>
+      <w:pPr>
+        <w:pStyle w:val="Normal"/>
+        <w:bidi w:val="0"/>
+        <w:jc w:val="start"/>
+        <w:rPr/>
+      </w:pPr>
+      <w:r>
+        <w:rPr/>
+      </w:r>
+    </w:p>
+    <w:p>
+      <w:pPr>
+        <w:pStyle w:val="Normal"/>
+        <w:bidi w:val="0"/>
+        <w:jc w:val="start"/>
+        <w:rPr/>
+      </w:pPr>
+      <w:r>
+        <w:rPr/>
+        <w:drawing>
+          <wp:anchor behindDoc="0" distT="0" distB="0" distL="0" distR="0" simplePos="0" locked="0" layoutInCell="0" allowOverlap="1" relativeHeight="10">
+            <wp:simplePos x="0" y="0"/>
+            <wp:positionH relativeFrom="column">
+              <wp:align>center</wp:align>
+            </wp:positionH>
+            <wp:positionV relativeFrom="paragraph">
+              <wp:posOffset>635</wp:posOffset>
+            </wp:positionV>
+            <wp:extent cx="6120130" cy="3321685"/>
+            <wp:effectExtent l="0" t="0" r="0" b="0"/>
+            <wp:wrapSquare wrapText="largest"/>
+            <wp:docPr id="9" name="Image9" descr="" title=""/>
+            <wp:cNvGraphicFramePr>
+              <a:graphicFrameLocks xmlns:a="http://schemas.openxmlformats.org/drawingml/2006/main" noChangeAspect="1"/>
+            </wp:cNvGraphicFramePr>
+            <a:graphic xmlns:a="http://schemas.openxmlformats.org/drawingml/2006/main">
+              <a:graphicData uri="http://schemas.openxmlformats.org/drawingml/2006/picture">
+                <pic:pic xmlns:pic="http://schemas.openxmlformats.org/drawingml/2006/picture">
+                  <pic:nvPicPr>
+                    <pic:cNvPr id="9" name="Image9" descr="" title=""/>
+                    <pic:cNvPicPr>
+                      <a:picLocks noChangeAspect="1" noChangeArrowheads="1"/>
+                    </pic:cNvPicPr>
+                  </pic:nvPicPr>
+                  <pic:blipFill>
+                    <a:blip r:embed="rId10"/>
+                    <a:stretch>
+                      <a:fillRect/>
+                    </a:stretch>
+                  </pic:blipFill>
+                  <pic:spPr bwMode="auto">
+                    <a:xfrm>
+                      <a:off x="0" y="0"/>
+                      <a:ext cx="6120130" cy="3321685"/>
+                    </a:xfrm>
+                    <a:prstGeom prst="rect">
+                      <a:avLst/>
+                    </a:prstGeom>
+                  </pic:spPr>
+                </pic:pic>
+              </a:graphicData>
+            </a:graphic>
+          </wp:anchor>
+        </w:drawing>
       </w:r>
     </w:p>
     <w:p>

</xml_diff>